<commit_message>
feat(communication): complete phase 6 communication, notifications and advanced testing
</commit_message>
<xml_diff>
--- a/docs/phase5/Weekly_Status_Report_Week5_Mihir_Dadwal.docx
+++ b/docs/phase5/Weekly_Status_Report_Week5_Mihir_Dadwal.docx
@@ -71,7 +71,23 @@
                 <w:rFonts w:ascii="Segoe UI" w:hAnsi="Segoe UI"/>
                 <w:sz w:val="19"/>
               </w:rPr>
-              <w:t>Project: KGSS 607 - HomeSlot Real Estate Listing &amp; Booking Platform</w:t>
+              <w:t xml:space="preserve">Project: KGSS 607 - </w:t>
+            </w:r>
+            <w:proofErr w:type="spellStart"/>
+            <w:r>
+              <w:rPr>
+                <w:rFonts w:ascii="Segoe UI" w:hAnsi="Segoe UI"/>
+                <w:sz w:val="19"/>
+              </w:rPr>
+              <w:t>HomeSlot</w:t>
+            </w:r>
+            <w:proofErr w:type="spellEnd"/>
+            <w:r>
+              <w:rPr>
+                <w:rFonts w:ascii="Segoe UI" w:hAnsi="Segoe UI"/>
+                <w:sz w:val="19"/>
+              </w:rPr>
+              <w:t xml:space="preserve"> Real Estate Listing &amp; Booking Platform</w:t>
             </w:r>
           </w:p>
         </w:tc>
@@ -171,7 +187,23 @@
                 <w:rFonts w:ascii="Segoe UI" w:hAnsi="Segoe UI"/>
                 <w:sz w:val="19"/>
               </w:rPr>
-              <w:t>Project Coordinator: Vaishali Pujari</w:t>
+              <w:t xml:space="preserve">Project Coordinator: </w:t>
+            </w:r>
+            <w:proofErr w:type="spellStart"/>
+            <w:r>
+              <w:rPr>
+                <w:rFonts w:ascii="Segoe UI" w:hAnsi="Segoe UI"/>
+                <w:sz w:val="19"/>
+              </w:rPr>
+              <w:t>Vaishali</w:t>
+            </w:r>
+            <w:proofErr w:type="spellEnd"/>
+            <w:r>
+              <w:rPr>
+                <w:rFonts w:ascii="Segoe UI" w:hAnsi="Segoe UI"/>
+                <w:sz w:val="19"/>
+              </w:rPr>
+              <w:t xml:space="preserve"> Pujari</w:t>
             </w:r>
           </w:p>
         </w:tc>
@@ -328,7 +360,25 @@
           <w:color w:val="000000"/>
           <w:sz w:val="21"/>
         </w:rPr>
-        <w:t>During Week 5 (02 Sep 2026 - 08 Sep 2026), the Admin, Approval &amp; Platform Management Module (Phase 5) of the HomeSlot Real Estate Platform was fully implemented, integrated, and verified. The primary objective of this phase was to deliver a centralized, high-performance Admin Operations Portal enabling platform administrators to oversee ecosystem metrics, moderate and approve property listings, verify developer partner KYC credentials, govern user accounts and roles, and audit all system administrative operations.</w:t>
+        <w:t xml:space="preserve">During Week 5 (02 Sep 2026 - 08 Sep 2026), the Admin, Approval &amp; Platform Management Module (Phase 5) of the </w:t>
+      </w:r>
+      <w:proofErr w:type="spellStart"/>
+      <w:r>
+        <w:rPr>
+          <w:rFonts w:ascii="Segoe UI" w:hAnsi="Segoe UI"/>
+          <w:color w:val="000000"/>
+          <w:sz w:val="21"/>
+        </w:rPr>
+        <w:t>HomeSlot</w:t>
+      </w:r>
+      <w:proofErr w:type="spellEnd"/>
+      <w:r>
+        <w:rPr>
+          <w:rFonts w:ascii="Segoe UI" w:hAnsi="Segoe UI"/>
+          <w:color w:val="000000"/>
+          <w:sz w:val="21"/>
+        </w:rPr>
+        <w:t xml:space="preserve"> Real Estate Platform was fully implemented, integrated, and verified. The primary objective of this phase was to deliver a centralized, high-performance Admin Operations Portal enabling platform administrators to oversee ecosystem metrics, moderate and approve property listings, verify developer partner KYC credentials, govern user accounts and roles, and audit all system administrative operations.</w:t>
       </w:r>
     </w:p>
     <w:p>
@@ -345,7 +395,43 @@
           <w:color w:val="000000"/>
           <w:sz w:val="21"/>
         </w:rPr>
-        <w:t>All scheduled functional deliverables were completed on time with 100% test pass rate across backend Spring Boot 3.x APIs (/api/v1/admin/**) and Angular 17 standalone UI components (AdminDashboardComponent).</w:t>
+        <w:t>All scheduled functional deliverables were completed on time with 100% test pass rate across backend Spring Boot 3.x APIs (/</w:t>
+      </w:r>
+      <w:proofErr w:type="spellStart"/>
+      <w:r>
+        <w:rPr>
+          <w:rFonts w:ascii="Segoe UI" w:hAnsi="Segoe UI"/>
+          <w:color w:val="000000"/>
+          <w:sz w:val="21"/>
+        </w:rPr>
+        <w:t>api</w:t>
+      </w:r>
+      <w:proofErr w:type="spellEnd"/>
+      <w:r>
+        <w:rPr>
+          <w:rFonts w:ascii="Segoe UI" w:hAnsi="Segoe UI"/>
+          <w:color w:val="000000"/>
+          <w:sz w:val="21"/>
+        </w:rPr>
+        <w:t>/v1/admin/**) and Angular 17 standalone UI components (</w:t>
+      </w:r>
+      <w:proofErr w:type="spellStart"/>
+      <w:r>
+        <w:rPr>
+          <w:rFonts w:ascii="Segoe UI" w:hAnsi="Segoe UI"/>
+          <w:color w:val="000000"/>
+          <w:sz w:val="21"/>
+        </w:rPr>
+        <w:t>AdminDashboardComponent</w:t>
+      </w:r>
+      <w:proofErr w:type="spellEnd"/>
+      <w:r>
+        <w:rPr>
+          <w:rFonts w:ascii="Segoe UI" w:hAnsi="Segoe UI"/>
+          <w:color w:val="000000"/>
+          <w:sz w:val="21"/>
+        </w:rPr>
+        <w:t>).</w:t>
       </w:r>
     </w:p>
     <w:p>
@@ -558,7 +644,23 @@
                 <w:rFonts w:ascii="Segoe UI" w:hAnsi="Segoe UI"/>
                 <w:sz w:val="18"/>
               </w:rPr>
-              <w:t>Built upgraded Admin Control Panel in Angular 17 and Spring Boot REST API (/api/v1/admin/dashboard/metrics) rendering live analytics for total users, buyers, developers, total properties, pending property approvals, pending builder verifications, total inquiries, and site visits.</w:t>
+              <w:t>Built upgraded Admin Control Panel in Angular 17 and Spring Boot REST API (/</w:t>
+            </w:r>
+            <w:proofErr w:type="spellStart"/>
+            <w:r>
+              <w:rPr>
+                <w:rFonts w:ascii="Segoe UI" w:hAnsi="Segoe UI"/>
+                <w:sz w:val="18"/>
+              </w:rPr>
+              <w:t>api</w:t>
+            </w:r>
+            <w:proofErr w:type="spellEnd"/>
+            <w:r>
+              <w:rPr>
+                <w:rFonts w:ascii="Segoe UI" w:hAnsi="Segoe UI"/>
+                <w:sz w:val="18"/>
+              </w:rPr>
+              <w:t>/v1/admin/dashboard/metrics) rendering live analytics for total users, buyers, developers, total properties, pending property approvals, pending builder verifications, total inquiries, and site visits.</w:t>
             </w:r>
           </w:p>
         </w:tc>
@@ -640,7 +742,63 @@
                 <w:rFonts w:ascii="Segoe UI" w:hAnsi="Segoe UI"/>
                 <w:sz w:val="18"/>
               </w:rPr>
-              <w:t>Extended Property entity with approvalStatus (PENDING_APPROVAL, APPROVED, REJECTED) and rejectionReason, developed approval endpoints (/api/v1/admin/properties/{id}/approval), moderation queue UI tab, and listing rejection modal.</w:t>
+              <w:t xml:space="preserve">Extended Property entity with </w:t>
+            </w:r>
+            <w:proofErr w:type="spellStart"/>
+            <w:r>
+              <w:rPr>
+                <w:rFonts w:ascii="Segoe UI" w:hAnsi="Segoe UI"/>
+                <w:sz w:val="18"/>
+              </w:rPr>
+              <w:t>approvalStatus</w:t>
+            </w:r>
+            <w:proofErr w:type="spellEnd"/>
+            <w:r>
+              <w:rPr>
+                <w:rFonts w:ascii="Segoe UI" w:hAnsi="Segoe UI"/>
+                <w:sz w:val="18"/>
+              </w:rPr>
+              <w:t xml:space="preserve"> (PENDING_APPROVAL, APPROVED, REJECTED) and </w:t>
+            </w:r>
+            <w:proofErr w:type="spellStart"/>
+            <w:r>
+              <w:rPr>
+                <w:rFonts w:ascii="Segoe UI" w:hAnsi="Segoe UI"/>
+                <w:sz w:val="18"/>
+              </w:rPr>
+              <w:t>rejectionReason</w:t>
+            </w:r>
+            <w:proofErr w:type="spellEnd"/>
+            <w:r>
+              <w:rPr>
+                <w:rFonts w:ascii="Segoe UI" w:hAnsi="Segoe UI"/>
+                <w:sz w:val="18"/>
+              </w:rPr>
+              <w:t>, developed approval endpoints (/</w:t>
+            </w:r>
+            <w:proofErr w:type="spellStart"/>
+            <w:r>
+              <w:rPr>
+                <w:rFonts w:ascii="Segoe UI" w:hAnsi="Segoe UI"/>
+                <w:sz w:val="18"/>
+              </w:rPr>
+              <w:t>api</w:t>
+            </w:r>
+            <w:proofErr w:type="spellEnd"/>
+            <w:r>
+              <w:rPr>
+                <w:rFonts w:ascii="Segoe UI" w:hAnsi="Segoe UI"/>
+                <w:sz w:val="18"/>
+              </w:rPr>
+              <w:t xml:space="preserve">/v1/admin/properties/{id}/approval), moderation queue UI </w:t>
+            </w:r>
+            <w:r>
+              <w:rPr>
+                <w:rFonts w:ascii="Segoe UI" w:hAnsi="Segoe UI"/>
+                <w:sz w:val="18"/>
+              </w:rPr>
+              <w:lastRenderedPageBreak/>
+              <w:t>tab, and listing rejection modal.</w:t>
             </w:r>
           </w:p>
         </w:tc>
@@ -662,6 +820,7 @@
                 <w:rFonts w:ascii="Segoe UI" w:hAnsi="Segoe UI"/>
                 <w:sz w:val="18"/>
               </w:rPr>
+              <w:lastRenderedPageBreak/>
               <w:t>Public Search Moderation Guard</w:t>
             </w:r>
           </w:p>
@@ -722,7 +881,39 @@
                 <w:rFonts w:ascii="Segoe UI" w:hAnsi="Segoe UI"/>
                 <w:sz w:val="18"/>
               </w:rPr>
-              <w:t>Updated PropertyService search queries to ensure public buyers exclusively browse approved listings (approvalStatus == 'APPROVED'), preventing unmoderated property content from appearing on public search pages.</w:t>
+              <w:t xml:space="preserve">Updated </w:t>
+            </w:r>
+            <w:proofErr w:type="spellStart"/>
+            <w:r>
+              <w:rPr>
+                <w:rFonts w:ascii="Segoe UI" w:hAnsi="Segoe UI"/>
+                <w:sz w:val="18"/>
+              </w:rPr>
+              <w:t>PropertyService</w:t>
+            </w:r>
+            <w:proofErr w:type="spellEnd"/>
+            <w:r>
+              <w:rPr>
+                <w:rFonts w:ascii="Segoe UI" w:hAnsi="Segoe UI"/>
+                <w:sz w:val="18"/>
+              </w:rPr>
+              <w:t xml:space="preserve"> search queries to ensure public buyers exclusively browse approved listings (</w:t>
+            </w:r>
+            <w:proofErr w:type="spellStart"/>
+            <w:r>
+              <w:rPr>
+                <w:rFonts w:ascii="Segoe UI" w:hAnsi="Segoe UI"/>
+                <w:sz w:val="18"/>
+              </w:rPr>
+              <w:t>approvalStatus</w:t>
+            </w:r>
+            <w:proofErr w:type="spellEnd"/>
+            <w:r>
+              <w:rPr>
+                <w:rFonts w:ascii="Segoe UI" w:hAnsi="Segoe UI"/>
+                <w:sz w:val="18"/>
+              </w:rPr>
+              <w:t xml:space="preserve"> == 'APPROVED'), preventing unmoderated property content from appearing on public search pages.</w:t>
             </w:r>
           </w:p>
         </w:tc>
@@ -804,7 +995,55 @@
                 <w:rFonts w:ascii="Segoe UI" w:hAnsi="Segoe UI"/>
                 <w:sz w:val="18"/>
               </w:rPr>
-              <w:t>Extended BuilderProfile entity with verificationStatus (PENDING, VERIFIED, REJECTED) and remarks, developed verification endpoints (/api/v1/admin/builders/{id}/verification), and builder partner verification table UI.</w:t>
+              <w:t xml:space="preserve">Extended </w:t>
+            </w:r>
+            <w:proofErr w:type="spellStart"/>
+            <w:r>
+              <w:rPr>
+                <w:rFonts w:ascii="Segoe UI" w:hAnsi="Segoe UI"/>
+                <w:sz w:val="18"/>
+              </w:rPr>
+              <w:t>BuilderProfile</w:t>
+            </w:r>
+            <w:proofErr w:type="spellEnd"/>
+            <w:r>
+              <w:rPr>
+                <w:rFonts w:ascii="Segoe UI" w:hAnsi="Segoe UI"/>
+                <w:sz w:val="18"/>
+              </w:rPr>
+              <w:t xml:space="preserve"> entity with </w:t>
+            </w:r>
+            <w:proofErr w:type="spellStart"/>
+            <w:r>
+              <w:rPr>
+                <w:rFonts w:ascii="Segoe UI" w:hAnsi="Segoe UI"/>
+                <w:sz w:val="18"/>
+              </w:rPr>
+              <w:t>verificationStatus</w:t>
+            </w:r>
+            <w:proofErr w:type="spellEnd"/>
+            <w:r>
+              <w:rPr>
+                <w:rFonts w:ascii="Segoe UI" w:hAnsi="Segoe UI"/>
+                <w:sz w:val="18"/>
+              </w:rPr>
+              <w:t xml:space="preserve"> (PENDING, VERIFIED, REJECTED) and remarks, developed verification endpoints (/</w:t>
+            </w:r>
+            <w:proofErr w:type="spellStart"/>
+            <w:r>
+              <w:rPr>
+                <w:rFonts w:ascii="Segoe UI" w:hAnsi="Segoe UI"/>
+                <w:sz w:val="18"/>
+              </w:rPr>
+              <w:t>api</w:t>
+            </w:r>
+            <w:proofErr w:type="spellEnd"/>
+            <w:r>
+              <w:rPr>
+                <w:rFonts w:ascii="Segoe UI" w:hAnsi="Segoe UI"/>
+                <w:sz w:val="18"/>
+              </w:rPr>
+              <w:t>/v1/admin/builders/{id}/verification), and builder partner verification table UI.</w:t>
             </w:r>
           </w:p>
         </w:tc>
@@ -886,7 +1125,23 @@
                 <w:rFonts w:ascii="Segoe UI" w:hAnsi="Segoe UI"/>
                 <w:sz w:val="18"/>
               </w:rPr>
-              <w:t>Built user management endpoints (/api/v1/admin/users) and governance table UI displaying system users, role badges (ROLE_BUYER, ROLE_BUILDER, ROLE_ADMIN), role filtering, search, and one-click account activation/deactivation triggers.</w:t>
+              <w:t>Built user management endpoints (/</w:t>
+            </w:r>
+            <w:proofErr w:type="spellStart"/>
+            <w:r>
+              <w:rPr>
+                <w:rFonts w:ascii="Segoe UI" w:hAnsi="Segoe UI"/>
+                <w:sz w:val="18"/>
+              </w:rPr>
+              <w:t>api</w:t>
+            </w:r>
+            <w:proofErr w:type="spellEnd"/>
+            <w:r>
+              <w:rPr>
+                <w:rFonts w:ascii="Segoe UI" w:hAnsi="Segoe UI"/>
+                <w:sz w:val="18"/>
+              </w:rPr>
+              <w:t>/v1/admin/users) and governance table UI displaying system users, role badges (ROLE_BUYER, ROLE_BUILDER, ROLE_ADMIN), role filtering, search, and one-click account activation/deactivation triggers.</w:t>
             </w:r>
           </w:p>
         </w:tc>
@@ -968,7 +1223,55 @@
                 <w:rFonts w:ascii="Segoe UI" w:hAnsi="Segoe UI"/>
                 <w:sz w:val="18"/>
               </w:rPr>
-              <w:t>Developed AuditLog JPA entity, AuditLogRepository, audit retrieval endpoints (/api/v1/admin/audit-logs), and audit trail table recording administrative actions, performer email, target entity, entity ID, and timestamp.</w:t>
+              <w:t xml:space="preserve">Developed </w:t>
+            </w:r>
+            <w:proofErr w:type="spellStart"/>
+            <w:r>
+              <w:rPr>
+                <w:rFonts w:ascii="Segoe UI" w:hAnsi="Segoe UI"/>
+                <w:sz w:val="18"/>
+              </w:rPr>
+              <w:t>AuditLog</w:t>
+            </w:r>
+            <w:proofErr w:type="spellEnd"/>
+            <w:r>
+              <w:rPr>
+                <w:rFonts w:ascii="Segoe UI" w:hAnsi="Segoe UI"/>
+                <w:sz w:val="18"/>
+              </w:rPr>
+              <w:t xml:space="preserve"> JPA entity, </w:t>
+            </w:r>
+            <w:proofErr w:type="spellStart"/>
+            <w:r>
+              <w:rPr>
+                <w:rFonts w:ascii="Segoe UI" w:hAnsi="Segoe UI"/>
+                <w:sz w:val="18"/>
+              </w:rPr>
+              <w:t>AuditLogRepository</w:t>
+            </w:r>
+            <w:proofErr w:type="spellEnd"/>
+            <w:r>
+              <w:rPr>
+                <w:rFonts w:ascii="Segoe UI" w:hAnsi="Segoe UI"/>
+                <w:sz w:val="18"/>
+              </w:rPr>
+              <w:t>, audit retrieval endpoints (/</w:t>
+            </w:r>
+            <w:proofErr w:type="spellStart"/>
+            <w:r>
+              <w:rPr>
+                <w:rFonts w:ascii="Segoe UI" w:hAnsi="Segoe UI"/>
+                <w:sz w:val="18"/>
+              </w:rPr>
+              <w:t>api</w:t>
+            </w:r>
+            <w:proofErr w:type="spellEnd"/>
+            <w:r>
+              <w:rPr>
+                <w:rFonts w:ascii="Segoe UI" w:hAnsi="Segoe UI"/>
+                <w:sz w:val="18"/>
+              </w:rPr>
+              <w:t>/v1/admin/audit-logs), and audit trail table recording administrative actions, performer email, target entity, entity ID, and timestamp.</w:t>
             </w:r>
           </w:p>
         </w:tc>
@@ -1050,7 +1353,39 @@
                 <w:rFonts w:ascii="Segoe UI" w:hAnsi="Segoe UI"/>
                 <w:sz w:val="18"/>
               </w:rPr>
-              <w:t>Enforced Spring Security @PreAuthorize('hasAuthority(''ROLE_ADMIN'')') across all admin governance endpoints, ensuring non-admin roles (ROLE_BUYER, ROLE_BUILDER) are strictly denied administrative access.</w:t>
+              <w:t>Enforced Spring Security @</w:t>
+            </w:r>
+            <w:proofErr w:type="spellStart"/>
+            <w:r>
+              <w:rPr>
+                <w:rFonts w:ascii="Segoe UI" w:hAnsi="Segoe UI"/>
+                <w:sz w:val="18"/>
+              </w:rPr>
+              <w:t>PreAuthorize</w:t>
+            </w:r>
+            <w:proofErr w:type="spellEnd"/>
+            <w:r>
+              <w:rPr>
+                <w:rFonts w:ascii="Segoe UI" w:hAnsi="Segoe UI"/>
+                <w:sz w:val="18"/>
+              </w:rPr>
+              <w:t>('</w:t>
+            </w:r>
+            <w:proofErr w:type="spellStart"/>
+            <w:r>
+              <w:rPr>
+                <w:rFonts w:ascii="Segoe UI" w:hAnsi="Segoe UI"/>
+                <w:sz w:val="18"/>
+              </w:rPr>
+              <w:t>hasAuthority</w:t>
+            </w:r>
+            <w:proofErr w:type="spellEnd"/>
+            <w:r>
+              <w:rPr>
+                <w:rFonts w:ascii="Segoe UI" w:hAnsi="Segoe UI"/>
+                <w:sz w:val="18"/>
+              </w:rPr>
+              <w:t>(''ROLE_ADMIN'')') across all admin governance endpoints, ensuring non-admin roles (ROLE_BUYER, ROLE_BUILDER) are strictly denied administrative access.</w:t>
             </w:r>
           </w:p>
         </w:tc>
@@ -1132,7 +1467,31 @@
                 <w:rFonts w:ascii="Segoe UI" w:hAnsi="Segoe UI"/>
                 <w:sz w:val="18"/>
               </w:rPr>
-              <w:t>Executed end-to-end browser subagent testing verifying admin login (admin@homeslot.com), property moderation, builder KYC verification, user status toggling, and audit log inspection with visual WebP recording and screenshot capture.</w:t>
+              <w:t xml:space="preserve">Executed end-to-end browser subagent testing </w:t>
+            </w:r>
+            <w:r>
+              <w:rPr>
+                <w:rFonts w:ascii="Segoe UI" w:hAnsi="Segoe UI"/>
+                <w:sz w:val="18"/>
+              </w:rPr>
+              <w:lastRenderedPageBreak/>
+              <w:t xml:space="preserve">verifying admin login (admin@homeslot.com), property moderation, builder KYC verification, user status toggling, and audit log inspection with visual </w:t>
+            </w:r>
+            <w:proofErr w:type="spellStart"/>
+            <w:r>
+              <w:rPr>
+                <w:rFonts w:ascii="Segoe UI" w:hAnsi="Segoe UI"/>
+                <w:sz w:val="18"/>
+              </w:rPr>
+              <w:t>WebP</w:t>
+            </w:r>
+            <w:proofErr w:type="spellEnd"/>
+            <w:r>
+              <w:rPr>
+                <w:rFonts w:ascii="Segoe UI" w:hAnsi="Segoe UI"/>
+                <w:sz w:val="18"/>
+              </w:rPr>
+              <w:t xml:space="preserve"> recording and screenshot capture.</w:t>
             </w:r>
           </w:p>
         </w:tc>
@@ -1171,7 +1530,61 @@
           <w:color w:val="000000"/>
           <w:sz w:val="21"/>
         </w:rPr>
-        <w:t>1. Server-Side Security &amp; Administrative RBAC: Enforced strict role-based access control using Spring Security @PreAuthorize('hasAuthority(''ROLE_ADMIN'')') on all /api/v1/admin/** endpoints, restricting governance capabilities exclusively to system administrators.</w:t>
+        <w:t>1. Server-Side Security &amp; Administrative RBAC: Enforced strict role-based access control using Spring Security @</w:t>
+      </w:r>
+      <w:proofErr w:type="spellStart"/>
+      <w:r>
+        <w:rPr>
+          <w:rFonts w:ascii="Segoe UI" w:hAnsi="Segoe UI"/>
+          <w:color w:val="000000"/>
+          <w:sz w:val="21"/>
+        </w:rPr>
+        <w:t>PreAuthorize</w:t>
+      </w:r>
+      <w:proofErr w:type="spellEnd"/>
+      <w:r>
+        <w:rPr>
+          <w:rFonts w:ascii="Segoe UI" w:hAnsi="Segoe UI"/>
+          <w:color w:val="000000"/>
+          <w:sz w:val="21"/>
+        </w:rPr>
+        <w:t>('</w:t>
+      </w:r>
+      <w:proofErr w:type="spellStart"/>
+      <w:r>
+        <w:rPr>
+          <w:rFonts w:ascii="Segoe UI" w:hAnsi="Segoe UI"/>
+          <w:color w:val="000000"/>
+          <w:sz w:val="21"/>
+        </w:rPr>
+        <w:t>hasAuthority</w:t>
+      </w:r>
+      <w:proofErr w:type="spellEnd"/>
+      <w:r>
+        <w:rPr>
+          <w:rFonts w:ascii="Segoe UI" w:hAnsi="Segoe UI"/>
+          <w:color w:val="000000"/>
+          <w:sz w:val="21"/>
+        </w:rPr>
+        <w:t>(''ROLE_ADMIN'')') on all /</w:t>
+      </w:r>
+      <w:proofErr w:type="spellStart"/>
+      <w:r>
+        <w:rPr>
+          <w:rFonts w:ascii="Segoe UI" w:hAnsi="Segoe UI"/>
+          <w:color w:val="000000"/>
+          <w:sz w:val="21"/>
+        </w:rPr>
+        <w:t>api</w:t>
+      </w:r>
+      <w:proofErr w:type="spellEnd"/>
+      <w:r>
+        <w:rPr>
+          <w:rFonts w:ascii="Segoe UI" w:hAnsi="Segoe UI"/>
+          <w:color w:val="000000"/>
+          <w:sz w:val="21"/>
+        </w:rPr>
+        <w:t>/v1/admin/** endpoints, restricting governance capabilities exclusively to system administrators.</w:t>
       </w:r>
     </w:p>
     <w:p>
@@ -1188,7 +1601,25 @@
           <w:color w:val="000000"/>
           <w:sz w:val="21"/>
         </w:rPr>
-        <w:t>2. Automated Audit Logging Framework: Implemented centralized audit trail logging in AdminService.java, automatically recording administrative actions (PROPERTY_MODERATED, BUILDER_VERIFIED, USER_STATUS_UPDATED, USER_ROLE_CHANGED) with performer email, target entity, and timestamp into the AuditLog database table.</w:t>
+        <w:t xml:space="preserve">2. Automated Audit Logging Framework: Implemented centralized audit trail logging in AdminService.java, automatically recording administrative actions (PROPERTY_MODERATED, BUILDER_VERIFIED, USER_STATUS_UPDATED, USER_ROLE_CHANGED) with performer email, target entity, and timestamp into the </w:t>
+      </w:r>
+      <w:proofErr w:type="spellStart"/>
+      <w:r>
+        <w:rPr>
+          <w:rFonts w:ascii="Segoe UI" w:hAnsi="Segoe UI"/>
+          <w:color w:val="000000"/>
+          <w:sz w:val="21"/>
+        </w:rPr>
+        <w:t>AuditLog</w:t>
+      </w:r>
+      <w:proofErr w:type="spellEnd"/>
+      <w:r>
+        <w:rPr>
+          <w:rFonts w:ascii="Segoe UI" w:hAnsi="Segoe UI"/>
+          <w:color w:val="000000"/>
+          <w:sz w:val="21"/>
+        </w:rPr>
+        <w:t xml:space="preserve"> database table.</w:t>
       </w:r>
     </w:p>
     <w:p>
@@ -1239,7 +1670,25 @@
           <w:color w:val="000000"/>
           <w:sz w:val="21"/>
         </w:rPr>
-        <w:t>5. Rich Multi-Tab Angular Admin Portal: Developed AdminDashboardComponent with dark slate operations theme, tabbed navigation (Overview, Property Approvals, Builder KYC, User Governance, Audit Logs), metric cards, filterable data tables, and modal dialogs.</w:t>
+        <w:t xml:space="preserve">5. Rich Multi-Tab Angular Admin Portal: Developed </w:t>
+      </w:r>
+      <w:proofErr w:type="spellStart"/>
+      <w:r>
+        <w:rPr>
+          <w:rFonts w:ascii="Segoe UI" w:hAnsi="Segoe UI"/>
+          <w:color w:val="000000"/>
+          <w:sz w:val="21"/>
+        </w:rPr>
+        <w:t>AdminDashboardComponent</w:t>
+      </w:r>
+      <w:proofErr w:type="spellEnd"/>
+      <w:r>
+        <w:rPr>
+          <w:rFonts w:ascii="Segoe UI" w:hAnsi="Segoe UI"/>
+          <w:color w:val="000000"/>
+          <w:sz w:val="21"/>
+        </w:rPr>
+        <w:t xml:space="preserve"> with dark slate operations theme, tabbed navigation (Overview, Property Approvals, Builder KYC, User Governance, Audit Logs), metric cards, filterable data tables, and modal dialogs.</w:t>
       </w:r>
     </w:p>
     <w:p>
@@ -1274,7 +1723,25 @@
           <w:color w:val="000000"/>
           <w:sz w:val="21"/>
         </w:rPr>
-        <w:t>â€¢ Backend Compilation: Executed 'mvn clean compile' â€</w:t>
+        <w:t>â€¢ Backend Compilation: Executed '</w:t>
+      </w:r>
+      <w:proofErr w:type="spellStart"/>
+      <w:r>
+        <w:rPr>
+          <w:rFonts w:ascii="Segoe UI" w:hAnsi="Segoe UI"/>
+          <w:color w:val="000000"/>
+          <w:sz w:val="21"/>
+        </w:rPr>
+        <w:t>mvn</w:t>
+      </w:r>
+      <w:proofErr w:type="spellEnd"/>
+      <w:r>
+        <w:rPr>
+          <w:rFonts w:ascii="Segoe UI" w:hAnsi="Segoe UI"/>
+          <w:color w:val="000000"/>
+          <w:sz w:val="21"/>
+        </w:rPr>
+        <w:t xml:space="preserve"> clean compile' â€</w:t>
       </w:r>
     </w:p>
     <w:p>
@@ -1291,7 +1758,43 @@
           <w:color w:val="000000"/>
           <w:sz w:val="21"/>
         </w:rPr>
-        <w:t>â€¢ Visual Proof &amp; Screenshots: Saved screenshot at docs/phase5/screenshots/admin_dashboard_overview.png and recorded WebP demonstration artifact.</w:t>
+        <w:t xml:space="preserve">â€¢ Visual Proof &amp; Screenshots: Saved screenshot at docs/phase5/screenshots/admin_dashboard_overview.png and recorded </w:t>
+      </w:r>
+      <w:proofErr w:type="spellStart"/>
+      <w:r>
+        <w:rPr>
+          <w:rFonts w:ascii="Segoe UI" w:hAnsi="Segoe UI"/>
+          <w:color w:val="000000"/>
+          <w:sz w:val="21"/>
+        </w:rPr>
+        <w:t>WebP</w:t>
+      </w:r>
+      <w:proofErr w:type="spellEnd"/>
+      <w:r>
+        <w:rPr>
+          <w:rFonts w:ascii="Segoe UI" w:hAnsi="Segoe UI"/>
+          <w:color w:val="000000"/>
+          <w:sz w:val="21"/>
+        </w:rPr>
+        <w:t xml:space="preserve"> demonstration </w:t>
+      </w:r>
+      <w:proofErr w:type="spellStart"/>
+      <w:r>
+        <w:rPr>
+          <w:rFonts w:ascii="Segoe UI" w:hAnsi="Segoe UI"/>
+          <w:color w:val="000000"/>
+          <w:sz w:val="21"/>
+        </w:rPr>
+        <w:t>artifact</w:t>
+      </w:r>
+      <w:proofErr w:type="spellEnd"/>
+      <w:r>
+        <w:rPr>
+          <w:rFonts w:ascii="Segoe UI" w:hAnsi="Segoe UI"/>
+          <w:color w:val="000000"/>
+          <w:sz w:val="21"/>
+        </w:rPr>
+        <w:t>.</w:t>
       </w:r>
     </w:p>
     <w:p>
@@ -1308,7 +1811,115 @@
           <w:color w:val="000000"/>
           <w:sz w:val="21"/>
         </w:rPr>
-        <w:t>â€¢ Deliverable Artifacts: Code committed to repository monorepo under backend/src/main/java/com/kgs/homeslot/module/admin/ and frontend/src/app/features/dashboard/admin-dashboard/.</w:t>
+        <w:t xml:space="preserve">â€¢ Deliverable </w:t>
+      </w:r>
+      <w:proofErr w:type="spellStart"/>
+      <w:r>
+        <w:rPr>
+          <w:rFonts w:ascii="Segoe UI" w:hAnsi="Segoe UI"/>
+          <w:color w:val="000000"/>
+          <w:sz w:val="21"/>
+        </w:rPr>
+        <w:t>Artifacts</w:t>
+      </w:r>
+      <w:proofErr w:type="spellEnd"/>
+      <w:r>
+        <w:rPr>
+          <w:rFonts w:ascii="Segoe UI" w:hAnsi="Segoe UI"/>
+          <w:color w:val="000000"/>
+          <w:sz w:val="21"/>
+        </w:rPr>
+        <w:t xml:space="preserve">: Code committed to repository </w:t>
+      </w:r>
+      <w:proofErr w:type="spellStart"/>
+      <w:r>
+        <w:rPr>
+          <w:rFonts w:ascii="Segoe UI" w:hAnsi="Segoe UI"/>
+          <w:color w:val="000000"/>
+          <w:sz w:val="21"/>
+        </w:rPr>
+        <w:t>monorepo</w:t>
+      </w:r>
+      <w:proofErr w:type="spellEnd"/>
+      <w:r>
+        <w:rPr>
+          <w:rFonts w:ascii="Segoe UI" w:hAnsi="Segoe UI"/>
+          <w:color w:val="000000"/>
+          <w:sz w:val="21"/>
+        </w:rPr>
+        <w:t xml:space="preserve"> under backend/</w:t>
+      </w:r>
+      <w:proofErr w:type="spellStart"/>
+      <w:r>
+        <w:rPr>
+          <w:rFonts w:ascii="Segoe UI" w:hAnsi="Segoe UI"/>
+          <w:color w:val="000000"/>
+          <w:sz w:val="21"/>
+        </w:rPr>
+        <w:t>src</w:t>
+      </w:r>
+      <w:proofErr w:type="spellEnd"/>
+      <w:r>
+        <w:rPr>
+          <w:rFonts w:ascii="Segoe UI" w:hAnsi="Segoe UI"/>
+          <w:color w:val="000000"/>
+          <w:sz w:val="21"/>
+        </w:rPr>
+        <w:t>/main/java/com/</w:t>
+      </w:r>
+      <w:proofErr w:type="spellStart"/>
+      <w:r>
+        <w:rPr>
+          <w:rFonts w:ascii="Segoe UI" w:hAnsi="Segoe UI"/>
+          <w:color w:val="000000"/>
+          <w:sz w:val="21"/>
+        </w:rPr>
+        <w:t>kgs</w:t>
+      </w:r>
+      <w:proofErr w:type="spellEnd"/>
+      <w:r>
+        <w:rPr>
+          <w:rFonts w:ascii="Segoe UI" w:hAnsi="Segoe UI"/>
+          <w:color w:val="000000"/>
+          <w:sz w:val="21"/>
+        </w:rPr>
+        <w:t>/</w:t>
+      </w:r>
+      <w:proofErr w:type="spellStart"/>
+      <w:r>
+        <w:rPr>
+          <w:rFonts w:ascii="Segoe UI" w:hAnsi="Segoe UI"/>
+          <w:color w:val="000000"/>
+          <w:sz w:val="21"/>
+        </w:rPr>
+        <w:t>homeslot</w:t>
+      </w:r>
+      <w:proofErr w:type="spellEnd"/>
+      <w:r>
+        <w:rPr>
+          <w:rFonts w:ascii="Segoe UI" w:hAnsi="Segoe UI"/>
+          <w:color w:val="000000"/>
+          <w:sz w:val="21"/>
+        </w:rPr>
+        <w:t>/module/admin/ and frontend/</w:t>
+      </w:r>
+      <w:proofErr w:type="spellStart"/>
+      <w:r>
+        <w:rPr>
+          <w:rFonts w:ascii="Segoe UI" w:hAnsi="Segoe UI"/>
+          <w:color w:val="000000"/>
+          <w:sz w:val="21"/>
+        </w:rPr>
+        <w:t>src</w:t>
+      </w:r>
+      <w:proofErr w:type="spellEnd"/>
+      <w:r>
+        <w:rPr>
+          <w:rFonts w:ascii="Segoe UI" w:hAnsi="Segoe UI"/>
+          <w:color w:val="000000"/>
+          <w:sz w:val="21"/>
+        </w:rPr>
+        <w:t>/app/features/dashboard/admin-dashboard/.</w:t>
       </w:r>
     </w:p>
     <w:p>
@@ -1606,148 +2217,138 @@
     <w:p/>
     <w:p>
       <w:pPr>
-        <w:pStyle w:val="Heading2"/>
-        <w:rPr>
-          <w:rFonts w:ascii="Segoe UI" w:hAnsi="Segoe UI"/>
-          <w:b/>
-          <w:color w:val="333333"/>
-        </w:rPr>
-      </w:pPr>
-      <w:r>
-        <w:rPr>
-          <w:rFonts w:ascii="Segoe UI" w:hAnsi="Segoe UI"/>
-          <w:b/>
-          <w:color w:val="333333"/>
-        </w:rPr>
-        <w:t>6. Plan for Next Week (Phase 6)</w:t>
-      </w:r>
-    </w:p>
-    <w:p>
-      <w:pPr>
-        <w:rPr>
-          <w:rFonts w:ascii="Segoe UI" w:hAnsi="Segoe UI"/>
-          <w:color w:val="000000"/>
-          <w:sz w:val="21"/>
-        </w:rPr>
-      </w:pPr>
-      <w:r>
-        <w:rPr>
-          <w:rFonts w:ascii="Segoe UI" w:hAnsi="Segoe UI"/>
-          <w:color w:val="000000"/>
-          <w:sz w:val="21"/>
-        </w:rPr>
-        <w:t>In Phase 6 (09 Sep 2026 - 14 Sep 2026), work will focus on Communication, Notifications &amp; Advanced Testing:</w:t>
-      </w:r>
-    </w:p>
-    <w:p>
-      <w:pPr>
-        <w:rPr>
-          <w:rFonts w:ascii="Segoe UI" w:hAnsi="Segoe UI"/>
-          <w:color w:val="000000"/>
-          <w:sz w:val="21"/>
-        </w:rPr>
-      </w:pPr>
-      <w:r>
-        <w:rPr>
-          <w:rFonts w:ascii="Segoe UI" w:hAnsi="Segoe UI"/>
-          <w:color w:val="000000"/>
-          <w:sz w:val="21"/>
-        </w:rPr>
-        <w:t>â€¢ Real-time Notification System (Inquiry Alerts, Visit Reminders, Approval Updates)</w:t>
-      </w:r>
-    </w:p>
-    <w:p>
-      <w:pPr>
-        <w:rPr>
-          <w:rFonts w:ascii="Segoe UI" w:hAnsi="Segoe UI"/>
-          <w:color w:val="000000"/>
-          <w:sz w:val="21"/>
-        </w:rPr>
-      </w:pPr>
-      <w:r>
-        <w:rPr>
-          <w:rFonts w:ascii="Segoe UI" w:hAnsi="Segoe UI"/>
-          <w:color w:val="000000"/>
-          <w:sz w:val="21"/>
-        </w:rPr>
-        <w:t>â€¢ Direct Messaging &amp; Chat Communication between Buyers &amp; Builders</w:t>
-      </w:r>
-    </w:p>
-    <w:p>
-      <w:pPr>
-        <w:rPr>
-          <w:rFonts w:ascii="Segoe UI" w:hAnsi="Segoe UI"/>
-          <w:color w:val="000000"/>
-          <w:sz w:val="21"/>
-        </w:rPr>
-      </w:pPr>
-      <w:r>
-        <w:rPr>
-          <w:rFonts w:ascii="Segoe UI" w:hAnsi="Segoe UI"/>
-          <w:color w:val="000000"/>
-          <w:sz w:val="21"/>
-        </w:rPr>
-        <w:t>â€¢ End-to-End Automated Integration Testing Suite</w:t>
-      </w:r>
-    </w:p>
-    <w:p>
-      <w:pPr>
-        <w:rPr>
-          <w:rFonts w:ascii="Segoe UI" w:hAnsi="Segoe UI"/>
-          <w:color w:val="000000"/>
-          <w:sz w:val="21"/>
-        </w:rPr>
-      </w:pPr>
-      <w:r>
-        <w:rPr>
-          <w:rFonts w:ascii="Segoe UI" w:hAnsi="Segoe UI"/>
-          <w:color w:val="000000"/>
-          <w:sz w:val="21"/>
-        </w:rPr>
-        <w:t>â€¢ Performance Tuning &amp; Database Index Optimization</w:t>
-      </w:r>
-    </w:p>
-    <w:p>
-      <w:pPr>
-        <w:rPr>
-          <w:rFonts w:ascii="Segoe UI" w:hAnsi="Segoe UI"/>
-          <w:color w:val="000000"/>
-          <w:sz w:val="21"/>
-        </w:rPr>
+        <w:pStyle w:val="NormalWeb"/>
       </w:pPr>
     </w:p>
     <w:p>
       <w:pPr>
-        <w:rPr>
-          <w:rFonts w:ascii="Segoe UI" w:hAnsi="Segoe UI"/>
-          <w:color w:val="000000"/>
-          <w:sz w:val="21"/>
-        </w:rPr>
+        <w:pStyle w:val="NormalWeb"/>
       </w:pPr>
-      <w:r>
-        <w:rPr>
-          <w:rFonts w:ascii="Segoe UI" w:hAnsi="Segoe UI"/>
-          <w:color w:val="000000"/>
-          <w:sz w:val="21"/>
-        </w:rPr>
-        <w:t>Prepared by: Mihir Dadwal (Software Engineer, KGS Technology Group)</w:t>
+      <w:proofErr w:type="spellStart"/>
+      <w:r>
+        <w:t>ScreenShots</w:t>
+      </w:r>
+      <w:proofErr w:type="spellEnd"/>
+      <w:r>
+        <w:t>:</w:t>
+      </w:r>
+      <w:r>
+        <w:br/>
+      </w:r>
+      <w:r>
+        <w:rPr>
+          <w:noProof/>
+        </w:rPr>
+        <w:drawing>
+          <wp:inline distT="0" distB="0" distL="0" distR="0">
+            <wp:extent cx="6016642" cy="2989519"/>
+            <wp:effectExtent l="0" t="0" r="3175" b="1905"/>
+            <wp:docPr id="1" name="Picture 1" descr="D:\KGS\KGS Real estate project code\docs\phase4\screenshots\builder_dashboard_overview.png"/>
+            <wp:cNvGraphicFramePr>
+              <a:graphicFrameLocks xmlns:a="http://schemas.openxmlformats.org/drawingml/2006/main" noChangeAspect="1"/>
+            </wp:cNvGraphicFramePr>
+            <a:graphic xmlns:a="http://schemas.openxmlformats.org/drawingml/2006/main">
+              <a:graphicData uri="http://schemas.openxmlformats.org/drawingml/2006/picture">
+                <pic:pic xmlns:pic="http://schemas.openxmlformats.org/drawingml/2006/picture">
+                  <pic:nvPicPr>
+                    <pic:cNvPr id="0" name="Picture 1" descr="D:\KGS\KGS Real estate project code\docs\phase4\screenshots\builder_dashboard_overview.png"/>
+                    <pic:cNvPicPr>
+                      <a:picLocks noChangeAspect="1" noChangeArrowheads="1"/>
+                    </pic:cNvPicPr>
+                  </pic:nvPicPr>
+                  <pic:blipFill>
+                    <a:blip r:embed="rId4" cstate="print">
+                      <a:extLst>
+                        <a:ext uri="{28A0092B-C50C-407E-A947-70E740481C1C}">
+                          <a14:useLocalDpi xmlns:a14="http://schemas.microsoft.com/office/drawing/2010/main" val="0"/>
+                        </a:ext>
+                      </a:extLst>
+                    </a:blip>
+                    <a:srcRect/>
+                    <a:stretch>
+                      <a:fillRect/>
+                    </a:stretch>
+                  </pic:blipFill>
+                  <pic:spPr bwMode="auto">
+                    <a:xfrm>
+                      <a:off x="0" y="0"/>
+                      <a:ext cx="6039739" cy="3000995"/>
+                    </a:xfrm>
+                    <a:prstGeom prst="rect">
+                      <a:avLst/>
+                    </a:prstGeom>
+                    <a:noFill/>
+                    <a:ln>
+                      <a:noFill/>
+                    </a:ln>
+                  </pic:spPr>
+                </pic:pic>
+              </a:graphicData>
+            </a:graphic>
+          </wp:inline>
+        </w:drawing>
+      </w:r>
+    </w:p>
+    <w:p>
+      <w:r>
+        <w:drawing>
+          <wp:inline distT="0" distB="0" distL="0" distR="0" wp14:anchorId="1A599CD9" wp14:editId="12A73349">
+            <wp:extent cx="5731510" cy="4222750"/>
+            <wp:effectExtent l="0" t="0" r="2540" b="6350"/>
+            <wp:docPr id="2" name="Picture 2"/>
+            <wp:cNvGraphicFramePr>
+              <a:graphicFrameLocks xmlns:a="http://schemas.openxmlformats.org/drawingml/2006/main" noChangeAspect="1"/>
+            </wp:cNvGraphicFramePr>
+            <a:graphic xmlns:a="http://schemas.openxmlformats.org/drawingml/2006/main">
+              <a:graphicData uri="http://schemas.openxmlformats.org/drawingml/2006/picture">
+                <pic:pic xmlns:pic="http://schemas.openxmlformats.org/drawingml/2006/picture">
+                  <pic:nvPicPr>
+                    <pic:cNvPr id="1" name=""/>
+                    <pic:cNvPicPr/>
+                  </pic:nvPicPr>
+                  <pic:blipFill>
+                    <a:blip r:embed="rId5"/>
+                    <a:stretch>
+                      <a:fillRect/>
+                    </a:stretch>
+                  </pic:blipFill>
+                  <pic:spPr>
+                    <a:xfrm>
+                      <a:off x="0" y="0"/>
+                      <a:ext cx="5731510" cy="4222750"/>
+                    </a:xfrm>
+                    <a:prstGeom prst="rect">
+                      <a:avLst/>
+                    </a:prstGeom>
+                  </pic:spPr>
+                </pic:pic>
+              </a:graphicData>
+            </a:graphic>
+          </wp:inline>
+        </w:drawing>
+      </w:r>
+      <w:bookmarkStart w:id="0" w:name="_GoBack"/>
+      <w:bookmarkEnd w:id="0"/>
+      <w:r>
+        <w:br/>
       </w:r>
     </w:p>
     <w:p>
       <w:pPr>
-        <w:rPr>
-          <w:rFonts w:ascii="Segoe UI" w:hAnsi="Segoe UI"/>
-          <w:color w:val="000000"/>
-          <w:sz w:val="21"/>
+        <w:pStyle w:val="Heading2"/>
+        <w:rPr>
+          <w:rFonts w:ascii="Segoe UI" w:hAnsi="Segoe UI"/>
+          <w:b/>
+          <w:color w:val="333333"/>
         </w:rPr>
       </w:pPr>
       <w:r>
         <w:rPr>
           <w:rFonts w:ascii="Segoe UI" w:hAnsi="Segoe UI"/>
-          <w:color w:val="000000"/>
-          <w:sz w:val="21"/>
-        </w:rPr>
-        <w:t>Approved by: Vaishali Pujari (Project Coordinator)</w:t>
+          <w:b/>
+          <w:color w:val="333333"/>
+        </w:rPr>
+        <w:t>6. Plan for Next Week (Phase 6)</w:t>
       </w:r>
     </w:p>
     <w:p>
@@ -1758,8 +2359,162 @@
           <w:sz w:val="21"/>
         </w:rPr>
       </w:pPr>
-      <w:bookmarkStart w:id="0" w:name="_GoBack"/>
-      <w:bookmarkEnd w:id="0"/>
+      <w:r>
+        <w:rPr>
+          <w:rFonts w:ascii="Segoe UI" w:hAnsi="Segoe UI"/>
+          <w:color w:val="000000"/>
+          <w:sz w:val="21"/>
+        </w:rPr>
+        <w:t>In Phase 6 (09 Sep 2026 - 14 Sep 2026), work will focus on Communication, Notifications &amp; Advanced Testing:</w:t>
+      </w:r>
+    </w:p>
+    <w:p>
+      <w:pPr>
+        <w:rPr>
+          <w:rFonts w:ascii="Segoe UI" w:hAnsi="Segoe UI"/>
+          <w:color w:val="000000"/>
+          <w:sz w:val="21"/>
+        </w:rPr>
+      </w:pPr>
+      <w:r>
+        <w:rPr>
+          <w:rFonts w:ascii="Segoe UI" w:hAnsi="Segoe UI"/>
+          <w:color w:val="000000"/>
+          <w:sz w:val="21"/>
+        </w:rPr>
+        <w:lastRenderedPageBreak/>
+        <w:t>â€¢ Real-time Notification System (Inquiry Alerts, Visit Reminders, Approval Updates)</w:t>
+      </w:r>
+    </w:p>
+    <w:p>
+      <w:pPr>
+        <w:rPr>
+          <w:rFonts w:ascii="Segoe UI" w:hAnsi="Segoe UI"/>
+          <w:color w:val="000000"/>
+          <w:sz w:val="21"/>
+        </w:rPr>
+      </w:pPr>
+      <w:r>
+        <w:rPr>
+          <w:rFonts w:ascii="Segoe UI" w:hAnsi="Segoe UI"/>
+          <w:color w:val="000000"/>
+          <w:sz w:val="21"/>
+        </w:rPr>
+        <w:t>â€¢ Direct Messaging &amp; Chat Communication between Buyers &amp; Builders</w:t>
+      </w:r>
+    </w:p>
+    <w:p>
+      <w:pPr>
+        <w:rPr>
+          <w:rFonts w:ascii="Segoe UI" w:hAnsi="Segoe UI"/>
+          <w:color w:val="000000"/>
+          <w:sz w:val="21"/>
+        </w:rPr>
+      </w:pPr>
+      <w:r>
+        <w:rPr>
+          <w:rFonts w:ascii="Segoe UI" w:hAnsi="Segoe UI"/>
+          <w:color w:val="000000"/>
+          <w:sz w:val="21"/>
+        </w:rPr>
+        <w:t>â€¢ End-to-End Automated Integration Testing Suite</w:t>
+      </w:r>
+    </w:p>
+    <w:p>
+      <w:pPr>
+        <w:rPr>
+          <w:rFonts w:ascii="Segoe UI" w:hAnsi="Segoe UI"/>
+          <w:color w:val="000000"/>
+          <w:sz w:val="21"/>
+        </w:rPr>
+      </w:pPr>
+      <w:r>
+        <w:rPr>
+          <w:rFonts w:ascii="Segoe UI" w:hAnsi="Segoe UI"/>
+          <w:color w:val="000000"/>
+          <w:sz w:val="21"/>
+        </w:rPr>
+        <w:t>â€¢ Performance Tuning &amp; Database Index Optimization</w:t>
+      </w:r>
+    </w:p>
+    <w:p>
+      <w:pPr>
+        <w:rPr>
+          <w:rFonts w:ascii="Segoe UI" w:hAnsi="Segoe UI"/>
+          <w:color w:val="000000"/>
+          <w:sz w:val="21"/>
+        </w:rPr>
+      </w:pPr>
+    </w:p>
+    <w:p>
+      <w:pPr>
+        <w:rPr>
+          <w:rFonts w:ascii="Segoe UI" w:hAnsi="Segoe UI"/>
+          <w:color w:val="000000"/>
+          <w:sz w:val="21"/>
+        </w:rPr>
+      </w:pPr>
+      <w:r>
+        <w:rPr>
+          <w:rFonts w:ascii="Segoe UI" w:hAnsi="Segoe UI"/>
+          <w:color w:val="000000"/>
+          <w:sz w:val="21"/>
+        </w:rPr>
+        <w:t>Prepared by: Mihir Dadwal (Software Engineer, KGS Technology Group)</w:t>
+      </w:r>
+    </w:p>
+    <w:p>
+      <w:pPr>
+        <w:rPr>
+          <w:rFonts w:ascii="Segoe UI" w:hAnsi="Segoe UI"/>
+          <w:color w:val="000000"/>
+          <w:sz w:val="21"/>
+        </w:rPr>
+      </w:pPr>
+      <w:r>
+        <w:rPr>
+          <w:rFonts w:ascii="Segoe UI" w:hAnsi="Segoe UI"/>
+          <w:color w:val="000000"/>
+          <w:sz w:val="21"/>
+        </w:rPr>
+        <w:t xml:space="preserve">Approved by: </w:t>
+      </w:r>
+      <w:proofErr w:type="spellStart"/>
+      <w:r>
+        <w:rPr>
+          <w:rFonts w:ascii="Segoe UI" w:hAnsi="Segoe UI"/>
+          <w:color w:val="000000"/>
+          <w:sz w:val="21"/>
+        </w:rPr>
+        <w:t>Vaishali</w:t>
+      </w:r>
+      <w:proofErr w:type="spellEnd"/>
+      <w:r>
+        <w:rPr>
+          <w:rFonts w:ascii="Segoe UI" w:hAnsi="Segoe UI"/>
+          <w:color w:val="000000"/>
+          <w:sz w:val="21"/>
+        </w:rPr>
+        <w:t xml:space="preserve"> Pujari (Project Coordinator)</w:t>
+      </w:r>
+    </w:p>
+    <w:p>
+      <w:pPr>
+        <w:rPr>
+          <w:rFonts w:ascii="Segoe UI" w:hAnsi="Segoe UI"/>
+          <w:color w:val="000000"/>
+          <w:sz w:val="21"/>
+        </w:rPr>
+      </w:pPr>
+    </w:p>
+    <w:p>
+      <w:pPr>
+        <w:rPr>
+          <w:rFonts w:ascii="Segoe UI" w:hAnsi="Segoe UI"/>
+          <w:color w:val="000000"/>
+          <w:sz w:val="21"/>
+        </w:rPr>
+      </w:pPr>
     </w:p>
     <w:sectPr>
       <w:pgSz w:w="11906" w:h="16838"/>
@@ -2280,6 +3035,23 @@
       </w:tblBorders>
     </w:tblPr>
   </w:style>
+  <w:style w:type="paragraph" w:styleId="NormalWeb">
+    <w:name w:val="Normal (Web)"/>
+    <w:basedOn w:val="Normal"/>
+    <w:uiPriority w:val="99"/>
+    <w:semiHidden/>
+    <w:unhideWhenUsed/>
+    <w:rsid w:val="009075D9"/>
+    <w:pPr>
+      <w:spacing w:before="100" w:beforeAutospacing="1" w:after="100" w:afterAutospacing="1" w:line="240" w:lineRule="auto"/>
+    </w:pPr>
+    <w:rPr>
+      <w:rFonts w:ascii="Times New Roman" w:eastAsia="Times New Roman" w:hAnsi="Times New Roman" w:cs="Times New Roman"/>
+      <w:sz w:val="24"/>
+      <w:szCs w:val="24"/>
+      <w:lang w:eastAsia="en-IN"/>
+    </w:rPr>
+  </w:style>
 </w:styles>
 </file>
 

</xml_diff>